<commit_message>
User guide (EN): Crew Trainers page - column table under the Step 6 heading, list changes before responsibility (5 -> 4 pages)
Co-Authored-By: Claude Sonnet 5.5 <noreply@anthropic.com>
Claude-Session: https://claude.ai/code/session_019dELNUNjVMr3Ja2mUwBrCu
</commit_message>
<xml_diff>
--- a/docs/user-guide/en/pages/04-crewtrainers.docx
+++ b/docs/user-guide/en/pages/04-crewtrainers.docx
@@ -1082,9 +1082,492 @@
         <w:t xml:space="preserve">Step 6 - Which stores need trainers?</w:t>
       </w:r>
     </w:p>
-    <w:p>
-      <w:pPr>
-        <w:keepNext w:val="false"/>
+    <w:tbl>
+      <w:tblPr>
+        <w:tblW w:type="dxa" w:w="9400"/>
+        <w:tblBorders>
+          <w:top w:val="single" w:color="auto" w:sz="4"/>
+          <w:left w:val="single" w:color="auto" w:sz="4"/>
+          <w:bottom w:val="single" w:color="auto" w:sz="4"/>
+          <w:right w:val="single" w:color="auto" w:sz="4"/>
+          <w:insideH w:val="single" w:color="auto" w:sz="4"/>
+          <w:insideV w:val="single" w:color="auto" w:sz="4"/>
+        </w:tblBorders>
+      </w:tblPr>
+      <w:tblGrid>
+        <w:gridCol w:w="2600"/>
+        <w:gridCol w:w="6800"/>
+      </w:tblGrid>
+      <w:tr>
+        <w:trPr>
+          <w:cantSplit/>
+          <w:tblHeader/>
+        </w:trPr>
+        <w:tc>
+          <w:tcPr>
+            <w:tcW w:type="dxa" w:w="2600"/>
+            <w:tcBorders>
+              <w:top w:val="single" w:color="D9D9D6" w:sz="4"/>
+              <w:left w:val="single" w:color="D9D9D6" w:sz="4"/>
+              <w:bottom w:val="single" w:color="D9D9D6" w:sz="4"/>
+              <w:right w:val="single" w:color="D9D9D6" w:sz="4"/>
+            </w:tcBorders>
+            <w:shd w:fill="FFC72C" w:color="auto" w:val="clear"/>
+            <w:tcMar>
+              <w:top w:type="dxa" w:w="70"/>
+              <w:left w:type="dxa" w:w="110"/>
+              <w:bottom w:type="dxa" w:w="70"/>
+              <w:right w:type="dxa" w:w="110"/>
+            </w:tcMar>
+          </w:tcPr>
+          <w:p>
+            <w:r>
+              <w:rPr>
+                <w:rFonts w:ascii="Arial" w:cs="Arial" w:eastAsia="Arial" w:hAnsi="Arial"/>
+                <w:b/>
+                <w:bCs/>
+                <w:color w:val="27251F"/>
+                <w:sz w:val="19"/>
+                <w:szCs w:val="19"/>
+              </w:rPr>
+              <w:t xml:space="preserve">Column</w:t>
+            </w:r>
+          </w:p>
+        </w:tc>
+        <w:tc>
+          <w:tcPr>
+            <w:tcW w:type="dxa" w:w="6800"/>
+            <w:tcBorders>
+              <w:top w:val="single" w:color="D9D9D6" w:sz="4"/>
+              <w:left w:val="single" w:color="D9D9D6" w:sz="4"/>
+              <w:bottom w:val="single" w:color="D9D9D6" w:sz="4"/>
+              <w:right w:val="single" w:color="D9D9D6" w:sz="4"/>
+            </w:tcBorders>
+            <w:shd w:fill="FFC72C" w:color="auto" w:val="clear"/>
+            <w:tcMar>
+              <w:top w:type="dxa" w:w="70"/>
+              <w:left w:type="dxa" w:w="110"/>
+              <w:bottom w:type="dxa" w:w="70"/>
+              <w:right w:type="dxa" w:w="110"/>
+            </w:tcMar>
+          </w:tcPr>
+          <w:p>
+            <w:r>
+              <w:rPr>
+                <w:rFonts w:ascii="Arial" w:cs="Arial" w:eastAsia="Arial" w:hAnsi="Arial"/>
+                <w:b/>
+                <w:bCs/>
+                <w:color w:val="27251F"/>
+                <w:sz w:val="19"/>
+                <w:szCs w:val="19"/>
+              </w:rPr>
+              <w:t xml:space="preserve">Meaning</w:t>
+            </w:r>
+          </w:p>
+        </w:tc>
+      </w:tr>
+      <w:tr>
+        <w:trPr>
+          <w:cantSplit/>
+          <w:tblHeader w:val="false"/>
+        </w:trPr>
+        <w:tc>
+          <w:tcPr>
+            <w:tcW w:type="dxa" w:w="2600"/>
+            <w:tcBorders>
+              <w:top w:val="single" w:color="D9D9D6" w:sz="4"/>
+              <w:left w:val="single" w:color="D9D9D6" w:sz="4"/>
+              <w:bottom w:val="single" w:color="D9D9D6" w:sz="4"/>
+              <w:right w:val="single" w:color="D9D9D6" w:sz="4"/>
+            </w:tcBorders>
+            <w:shd w:fill="FFFFFF" w:color="auto" w:val="clear"/>
+            <w:tcMar>
+              <w:top w:type="dxa" w:w="70"/>
+              <w:left w:type="dxa" w:w="110"/>
+              <w:bottom w:type="dxa" w:w="70"/>
+              <w:right w:type="dxa" w:w="110"/>
+            </w:tcMar>
+          </w:tcPr>
+          <w:p>
+            <w:r>
+              <w:rPr>
+                <w:rFonts w:ascii="Arial" w:cs="Arial" w:eastAsia="Arial" w:hAnsi="Arial"/>
+                <w:color w:val="27251F"/>
+                <w:sz w:val="19"/>
+                <w:szCs w:val="19"/>
+              </w:rPr>
+              <w:t xml:space="preserve">Crew level</w:t>
+            </w:r>
+          </w:p>
+        </w:tc>
+        <w:tc>
+          <w:tcPr>
+            <w:tcW w:type="dxa" w:w="6800"/>
+            <w:tcBorders>
+              <w:top w:val="single" w:color="D9D9D6" w:sz="4"/>
+              <w:left w:val="single" w:color="D9D9D6" w:sz="4"/>
+              <w:bottom w:val="single" w:color="D9D9D6" w:sz="4"/>
+              <w:right w:val="single" w:color="D9D9D6" w:sz="4"/>
+            </w:tcBorders>
+            <w:shd w:fill="FFFFFF" w:color="auto" w:val="clear"/>
+            <w:tcMar>
+              <w:top w:type="dxa" w:w="70"/>
+              <w:left w:type="dxa" w:w="110"/>
+              <w:bottom w:type="dxa" w:w="70"/>
+              <w:right w:type="dxa" w:w="110"/>
+            </w:tcMar>
+          </w:tcPr>
+          <w:p>
+            <w:r>
+              <w:rPr>
+                <w:rFonts w:ascii="Arial" w:cs="Arial" w:eastAsia="Arial" w:hAnsi="Arial"/>
+                <w:color w:val="27251F"/>
+                <w:sz w:val="19"/>
+                <w:szCs w:val="19"/>
+              </w:rPr>
+              <w:t xml:space="preserve">The people the trainers train.</w:t>
+            </w:r>
+          </w:p>
+        </w:tc>
+      </w:tr>
+      <w:tr>
+        <w:trPr>
+          <w:cantSplit/>
+          <w:tblHeader w:val="false"/>
+        </w:trPr>
+        <w:tc>
+          <w:tcPr>
+            <w:tcW w:type="dxa" w:w="2600"/>
+            <w:tcBorders>
+              <w:top w:val="single" w:color="D9D9D6" w:sz="4"/>
+              <w:left w:val="single" w:color="D9D9D6" w:sz="4"/>
+              <w:bottom w:val="single" w:color="D9D9D6" w:sz="4"/>
+              <w:right w:val="single" w:color="D9D9D6" w:sz="4"/>
+            </w:tcBorders>
+            <w:shd w:fill="FFFFFF" w:color="auto" w:val="clear"/>
+            <w:tcMar>
+              <w:top w:type="dxa" w:w="70"/>
+              <w:left w:type="dxa" w:w="110"/>
+              <w:bottom w:type="dxa" w:w="70"/>
+              <w:right w:type="dxa" w:w="110"/>
+            </w:tcMar>
+          </w:tcPr>
+          <w:p>
+            <w:r>
+              <w:rPr>
+                <w:rFonts w:ascii="Arial" w:cs="Arial" w:eastAsia="Arial" w:hAnsi="Arial"/>
+                <w:color w:val="27251F"/>
+                <w:sz w:val="19"/>
+                <w:szCs w:val="19"/>
+              </w:rPr>
+              <w:t xml:space="preserve">Required</w:t>
+            </w:r>
+          </w:p>
+        </w:tc>
+        <w:tc>
+          <w:tcPr>
+            <w:tcW w:type="dxa" w:w="6800"/>
+            <w:tcBorders>
+              <w:top w:val="single" w:color="D9D9D6" w:sz="4"/>
+              <w:left w:val="single" w:color="D9D9D6" w:sz="4"/>
+              <w:bottom w:val="single" w:color="D9D9D6" w:sz="4"/>
+              <w:right w:val="single" w:color="D9D9D6" w:sz="4"/>
+            </w:tcBorders>
+            <w:shd w:fill="FFFFFF" w:color="auto" w:val="clear"/>
+            <w:tcMar>
+              <w:top w:type="dxa" w:w="70"/>
+              <w:left w:type="dxa" w:w="110"/>
+              <w:bottom w:type="dxa" w:w="70"/>
+              <w:right w:type="dxa" w:w="110"/>
+            </w:tcMar>
+          </w:tcPr>
+          <w:p>
+            <w:r>
+              <w:rPr>
+                <w:rFonts w:ascii="Arial" w:cs="Arial" w:eastAsia="Arial" w:hAnsi="Arial"/>
+                <w:color w:val="27251F"/>
+                <w:sz w:val="19"/>
+                <w:szCs w:val="19"/>
+              </w:rPr>
+              <w:t xml:space="preserve">Crew level divided by 6, rounded to the nearest whole number (a half rounds up).</w:t>
+            </w:r>
+          </w:p>
+        </w:tc>
+      </w:tr>
+      <w:tr>
+        <w:trPr>
+          <w:cantSplit/>
+          <w:tblHeader w:val="false"/>
+        </w:trPr>
+        <w:tc>
+          <w:tcPr>
+            <w:tcW w:type="dxa" w:w="2600"/>
+            <w:tcBorders>
+              <w:top w:val="single" w:color="D9D9D6" w:sz="4"/>
+              <w:left w:val="single" w:color="D9D9D6" w:sz="4"/>
+              <w:bottom w:val="single" w:color="D9D9D6" w:sz="4"/>
+              <w:right w:val="single" w:color="D9D9D6" w:sz="4"/>
+            </w:tcBorders>
+            <w:shd w:fill="FFFFFF" w:color="auto" w:val="clear"/>
+            <w:tcMar>
+              <w:top w:type="dxa" w:w="70"/>
+              <w:left w:type="dxa" w:w="110"/>
+              <w:bottom w:type="dxa" w:w="70"/>
+              <w:right w:type="dxa" w:w="110"/>
+            </w:tcMar>
+          </w:tcPr>
+          <w:p>
+            <w:r>
+              <w:rPr>
+                <w:rFonts w:ascii="Arial" w:cs="Arial" w:eastAsia="Arial" w:hAnsi="Arial"/>
+                <w:color w:val="27251F"/>
+                <w:sz w:val="19"/>
+                <w:szCs w:val="19"/>
+              </w:rPr>
+              <w:t xml:space="preserve">Actual</w:t>
+            </w:r>
+          </w:p>
+        </w:tc>
+        <w:tc>
+          <w:tcPr>
+            <w:tcW w:type="dxa" w:w="6800"/>
+            <w:tcBorders>
+              <w:top w:val="single" w:color="D9D9D6" w:sz="4"/>
+              <w:left w:val="single" w:color="D9D9D6" w:sz="4"/>
+              <w:bottom w:val="single" w:color="D9D9D6" w:sz="4"/>
+              <w:right w:val="single" w:color="D9D9D6" w:sz="4"/>
+            </w:tcBorders>
+            <w:shd w:fill="FFFFFF" w:color="auto" w:val="clear"/>
+            <w:tcMar>
+              <w:top w:type="dxa" w:w="70"/>
+              <w:left w:type="dxa" w:w="110"/>
+              <w:bottom w:type="dxa" w:w="70"/>
+              <w:right w:type="dxa" w:w="110"/>
+            </w:tcMar>
+          </w:tcPr>
+          <w:p>
+            <w:r>
+              <w:rPr>
+                <w:rFonts w:ascii="Arial" w:cs="Arial" w:eastAsia="Arial" w:hAnsi="Arial"/>
+                <w:color w:val="27251F"/>
+                <w:sz w:val="19"/>
+                <w:szCs w:val="19"/>
+              </w:rPr>
+              <w:t xml:space="preserve">Actual trainers in the store.</w:t>
+            </w:r>
+          </w:p>
+        </w:tc>
+      </w:tr>
+      <w:tr>
+        <w:trPr>
+          <w:cantSplit/>
+          <w:tblHeader w:val="false"/>
+        </w:trPr>
+        <w:tc>
+          <w:tcPr>
+            <w:tcW w:type="dxa" w:w="2600"/>
+            <w:tcBorders>
+              <w:top w:val="single" w:color="D9D9D6" w:sz="4"/>
+              <w:left w:val="single" w:color="D9D9D6" w:sz="4"/>
+              <w:bottom w:val="single" w:color="D9D9D6" w:sz="4"/>
+              <w:right w:val="single" w:color="D9D9D6" w:sz="4"/>
+            </w:tcBorders>
+            <w:shd w:fill="FFFFFF" w:color="auto" w:val="clear"/>
+            <w:tcMar>
+              <w:top w:type="dxa" w:w="70"/>
+              <w:left w:type="dxa" w:w="110"/>
+              <w:bottom w:type="dxa" w:w="70"/>
+              <w:right w:type="dxa" w:w="110"/>
+            </w:tcMar>
+          </w:tcPr>
+          <w:p>
+            <w:r>
+              <w:rPr>
+                <w:rFonts w:ascii="Arial" w:cs="Arial" w:eastAsia="Arial" w:hAnsi="Arial"/>
+                <w:color w:val="27251F"/>
+                <w:sz w:val="19"/>
+                <w:szCs w:val="19"/>
+              </w:rPr>
+              <w:t xml:space="preserve">Gap vs rule</w:t>
+            </w:r>
+          </w:p>
+        </w:tc>
+        <w:tc>
+          <w:tcPr>
+            <w:tcW w:type="dxa" w:w="6800"/>
+            <w:tcBorders>
+              <w:top w:val="single" w:color="D9D9D6" w:sz="4"/>
+              <w:left w:val="single" w:color="D9D9D6" w:sz="4"/>
+              <w:bottom w:val="single" w:color="D9D9D6" w:sz="4"/>
+              <w:right w:val="single" w:color="D9D9D6" w:sz="4"/>
+            </w:tcBorders>
+            <w:shd w:fill="FFFFFF" w:color="auto" w:val="clear"/>
+            <w:tcMar>
+              <w:top w:type="dxa" w:w="70"/>
+              <w:left w:type="dxa" w:w="110"/>
+              <w:bottom w:type="dxa" w:w="70"/>
+              <w:right w:type="dxa" w:w="110"/>
+            </w:tcMar>
+          </w:tcPr>
+          <w:p>
+            <w:r>
+              <w:rPr>
+                <w:rFonts w:ascii="Arial" w:cs="Arial" w:eastAsia="Arial" w:hAnsi="Arial"/>
+                <w:color w:val="27251F"/>
+                <w:sz w:val="19"/>
+                <w:szCs w:val="19"/>
+              </w:rPr>
+              <w:t xml:space="preserve">Actual minus required. Negative = short of trainers, positive = over.</w:t>
+            </w:r>
+          </w:p>
+        </w:tc>
+      </w:tr>
+      <w:tr>
+        <w:trPr>
+          <w:cantSplit/>
+          <w:tblHeader w:val="false"/>
+        </w:trPr>
+        <w:tc>
+          <w:tcPr>
+            <w:tcW w:type="dxa" w:w="2600"/>
+            <w:tcBorders>
+              <w:top w:val="single" w:color="D9D9D6" w:sz="4"/>
+              <w:left w:val="single" w:color="D9D9D6" w:sz="4"/>
+              <w:bottom w:val="single" w:color="D9D9D6" w:sz="4"/>
+              <w:right w:val="single" w:color="D9D9D6" w:sz="4"/>
+            </w:tcBorders>
+            <w:shd w:fill="FFFFFF" w:color="auto" w:val="clear"/>
+            <w:tcMar>
+              <w:top w:type="dxa" w:w="70"/>
+              <w:left w:type="dxa" w:w="110"/>
+              <w:bottom w:type="dxa" w:w="70"/>
+              <w:right w:type="dxa" w:w="110"/>
+            </w:tcMar>
+          </w:tcPr>
+          <w:p>
+            <w:r>
+              <w:rPr>
+                <w:rFonts w:ascii="Arial" w:cs="Arial" w:eastAsia="Arial" w:hAnsi="Arial"/>
+                <w:color w:val="27251F"/>
+                <w:sz w:val="19"/>
+                <w:szCs w:val="19"/>
+              </w:rPr>
+              <w:t xml:space="preserve">Projected / Gap vs plan</w:t>
+            </w:r>
+          </w:p>
+        </w:tc>
+        <w:tc>
+          <w:tcPr>
+            <w:tcW w:type="dxa" w:w="6800"/>
+            <w:tcBorders>
+              <w:top w:val="single" w:color="D9D9D6" w:sz="4"/>
+              <w:left w:val="single" w:color="D9D9D6" w:sz="4"/>
+              <w:bottom w:val="single" w:color="D9D9D6" w:sz="4"/>
+              <w:right w:val="single" w:color="D9D9D6" w:sz="4"/>
+            </w:tcBorders>
+            <w:shd w:fill="FFFFFF" w:color="auto" w:val="clear"/>
+            <w:tcMar>
+              <w:top w:type="dxa" w:w="70"/>
+              <w:left w:type="dxa" w:w="110"/>
+              <w:bottom w:type="dxa" w:w="70"/>
+              <w:right w:type="dxa" w:w="110"/>
+            </w:tcMar>
+          </w:tcPr>
+          <w:p>
+            <w:r>
+              <w:rPr>
+                <w:rFonts w:ascii="Arial" w:cs="Arial" w:eastAsia="Arial" w:hAnsi="Arial"/>
+                <w:color w:val="27251F"/>
+                <w:sz w:val="19"/>
+                <w:szCs w:val="19"/>
+              </w:rPr>
+              <w:t xml:space="preserve">The trainers in the projection, and actual minus projected.</w:t>
+            </w:r>
+          </w:p>
+        </w:tc>
+      </w:tr>
+      <w:tr>
+        <w:trPr>
+          <w:cantSplit/>
+          <w:tblHeader w:val="false"/>
+        </w:trPr>
+        <w:tc>
+          <w:tcPr>
+            <w:tcW w:type="dxa" w:w="2600"/>
+            <w:tcBorders>
+              <w:top w:val="single" w:color="D9D9D6" w:sz="4"/>
+              <w:left w:val="single" w:color="D9D9D6" w:sz="4"/>
+              <w:bottom w:val="single" w:color="D9D9D6" w:sz="4"/>
+              <w:right w:val="single" w:color="D9D9D6" w:sz="4"/>
+            </w:tcBorders>
+            <w:shd w:fill="FFFFFF" w:color="auto" w:val="clear"/>
+            <w:tcMar>
+              <w:top w:type="dxa" w:w="70"/>
+              <w:left w:type="dxa" w:w="110"/>
+              <w:bottom w:type="dxa" w:w="70"/>
+              <w:right w:type="dxa" w:w="110"/>
+            </w:tcMar>
+          </w:tcPr>
+          <w:p>
+            <w:r>
+              <w:rPr>
+                <w:rFonts w:ascii="Arial" w:cs="Arial" w:eastAsia="Arial" w:hAnsi="Arial"/>
+                <w:color w:val="27251F"/>
+                <w:sz w:val="19"/>
+                <w:szCs w:val="19"/>
+              </w:rPr>
+              <w:t xml:space="preserve">Status</w:t>
+            </w:r>
+          </w:p>
+        </w:tc>
+        <w:tc>
+          <w:tcPr>
+            <w:tcW w:type="dxa" w:w="6800"/>
+            <w:tcBorders>
+              <w:top w:val="single" w:color="D9D9D6" w:sz="4"/>
+              <w:left w:val="single" w:color="D9D9D6" w:sz="4"/>
+              <w:bottom w:val="single" w:color="D9D9D6" w:sz="4"/>
+              <w:right w:val="single" w:color="D9D9D6" w:sz="4"/>
+            </w:tcBorders>
+            <w:shd w:fill="FFFFFF" w:color="auto" w:val="clear"/>
+            <w:tcMar>
+              <w:top w:type="dxa" w:w="70"/>
+              <w:left w:type="dxa" w:w="110"/>
+              <w:bottom w:type="dxa" w:w="70"/>
+              <w:right w:type="dxa" w:w="110"/>
+            </w:tcMar>
+          </w:tcPr>
+          <w:p>
+            <w:r>
+              <w:rPr>
+                <w:rFonts w:ascii="Arial" w:cs="Arial" w:eastAsia="Arial" w:hAnsi="Arial"/>
+                <w:color w:val="27251F"/>
+                <w:sz w:val="19"/>
+                <w:szCs w:val="19"/>
+              </w:rPr>
+              <w:t xml:space="preserve">Over, Enough, Short, No trainers, or Not needed (none required and none present).</w:t>
+            </w:r>
+          </w:p>
+        </w:tc>
+      </w:tr>
+    </w:tbl>
+    <w:p>
+      <w:pPr>
+        <w:spacing w:after="40"/>
+      </w:pPr>
+      <w:r>
+        <w:rPr>
+          <w:rFonts w:ascii="Arial" w:cs="Arial" w:eastAsia="Arial" w:hAnsi="Arial"/>
+          <w:color w:val="27251F"/>
+          <w:sz w:val="21"/>
+          <w:szCs w:val="21"/>
+        </w:rPr>
+        <w:t xml:space="preserve"/>
+      </w:r>
+    </w:p>
+    <w:p>
+      <w:pPr>
+        <w:keepNext/>
         <w:spacing w:after="120" w:before="60"/>
         <w:jc w:val="center"/>
       </w:pPr>
@@ -1129,492 +1612,9 @@
         </w:drawing>
       </w:r>
     </w:p>
-    <w:tbl>
-      <w:tblPr>
-        <w:tblW w:type="dxa" w:w="9400"/>
-        <w:tblBorders>
-          <w:top w:val="single" w:color="auto" w:sz="4"/>
-          <w:left w:val="single" w:color="auto" w:sz="4"/>
-          <w:bottom w:val="single" w:color="auto" w:sz="4"/>
-          <w:right w:val="single" w:color="auto" w:sz="4"/>
-          <w:insideH w:val="single" w:color="auto" w:sz="4"/>
-          <w:insideV w:val="single" w:color="auto" w:sz="4"/>
-        </w:tblBorders>
-      </w:tblPr>
-      <w:tblGrid>
-        <w:gridCol w:w="2600"/>
-        <w:gridCol w:w="6800"/>
-      </w:tblGrid>
-      <w:tr>
-        <w:trPr>
-          <w:cantSplit/>
-          <w:tblHeader/>
-        </w:trPr>
-        <w:tc>
-          <w:tcPr>
-            <w:tcW w:type="dxa" w:w="2600"/>
-            <w:tcBorders>
-              <w:top w:val="single" w:color="D9D9D6" w:sz="4"/>
-              <w:left w:val="single" w:color="D9D9D6" w:sz="4"/>
-              <w:bottom w:val="single" w:color="D9D9D6" w:sz="4"/>
-              <w:right w:val="single" w:color="D9D9D6" w:sz="4"/>
-            </w:tcBorders>
-            <w:shd w:fill="FFC72C" w:color="auto" w:val="clear"/>
-            <w:tcMar>
-              <w:top w:type="dxa" w:w="70"/>
-              <w:left w:type="dxa" w:w="110"/>
-              <w:bottom w:type="dxa" w:w="70"/>
-              <w:right w:type="dxa" w:w="110"/>
-            </w:tcMar>
-          </w:tcPr>
-          <w:p>
-            <w:r>
-              <w:rPr>
-                <w:rFonts w:ascii="Arial" w:cs="Arial" w:eastAsia="Arial" w:hAnsi="Arial"/>
-                <w:b/>
-                <w:bCs/>
-                <w:color w:val="27251F"/>
-                <w:sz w:val="19"/>
-                <w:szCs w:val="19"/>
-              </w:rPr>
-              <w:t xml:space="preserve">Column</w:t>
-            </w:r>
-          </w:p>
-        </w:tc>
-        <w:tc>
-          <w:tcPr>
-            <w:tcW w:type="dxa" w:w="6800"/>
-            <w:tcBorders>
-              <w:top w:val="single" w:color="D9D9D6" w:sz="4"/>
-              <w:left w:val="single" w:color="D9D9D6" w:sz="4"/>
-              <w:bottom w:val="single" w:color="D9D9D6" w:sz="4"/>
-              <w:right w:val="single" w:color="D9D9D6" w:sz="4"/>
-            </w:tcBorders>
-            <w:shd w:fill="FFC72C" w:color="auto" w:val="clear"/>
-            <w:tcMar>
-              <w:top w:type="dxa" w:w="70"/>
-              <w:left w:type="dxa" w:w="110"/>
-              <w:bottom w:type="dxa" w:w="70"/>
-              <w:right w:type="dxa" w:w="110"/>
-            </w:tcMar>
-          </w:tcPr>
-          <w:p>
-            <w:r>
-              <w:rPr>
-                <w:rFonts w:ascii="Arial" w:cs="Arial" w:eastAsia="Arial" w:hAnsi="Arial"/>
-                <w:b/>
-                <w:bCs/>
-                <w:color w:val="27251F"/>
-                <w:sz w:val="19"/>
-                <w:szCs w:val="19"/>
-              </w:rPr>
-              <w:t xml:space="preserve">Meaning</w:t>
-            </w:r>
-          </w:p>
-        </w:tc>
-      </w:tr>
-      <w:tr>
-        <w:trPr>
-          <w:cantSplit/>
-          <w:tblHeader w:val="false"/>
-        </w:trPr>
-        <w:tc>
-          <w:tcPr>
-            <w:tcW w:type="dxa" w:w="2600"/>
-            <w:tcBorders>
-              <w:top w:val="single" w:color="D9D9D6" w:sz="4"/>
-              <w:left w:val="single" w:color="D9D9D6" w:sz="4"/>
-              <w:bottom w:val="single" w:color="D9D9D6" w:sz="4"/>
-              <w:right w:val="single" w:color="D9D9D6" w:sz="4"/>
-            </w:tcBorders>
-            <w:shd w:fill="FFFFFF" w:color="auto" w:val="clear"/>
-            <w:tcMar>
-              <w:top w:type="dxa" w:w="70"/>
-              <w:left w:type="dxa" w:w="110"/>
-              <w:bottom w:type="dxa" w:w="70"/>
-              <w:right w:type="dxa" w:w="110"/>
-            </w:tcMar>
-          </w:tcPr>
-          <w:p>
-            <w:r>
-              <w:rPr>
-                <w:rFonts w:ascii="Arial" w:cs="Arial" w:eastAsia="Arial" w:hAnsi="Arial"/>
-                <w:color w:val="27251F"/>
-                <w:sz w:val="19"/>
-                <w:szCs w:val="19"/>
-              </w:rPr>
-              <w:t xml:space="preserve">Crew level</w:t>
-            </w:r>
-          </w:p>
-        </w:tc>
-        <w:tc>
-          <w:tcPr>
-            <w:tcW w:type="dxa" w:w="6800"/>
-            <w:tcBorders>
-              <w:top w:val="single" w:color="D9D9D6" w:sz="4"/>
-              <w:left w:val="single" w:color="D9D9D6" w:sz="4"/>
-              <w:bottom w:val="single" w:color="D9D9D6" w:sz="4"/>
-              <w:right w:val="single" w:color="D9D9D6" w:sz="4"/>
-            </w:tcBorders>
-            <w:shd w:fill="FFFFFF" w:color="auto" w:val="clear"/>
-            <w:tcMar>
-              <w:top w:type="dxa" w:w="70"/>
-              <w:left w:type="dxa" w:w="110"/>
-              <w:bottom w:type="dxa" w:w="70"/>
-              <w:right w:type="dxa" w:w="110"/>
-            </w:tcMar>
-          </w:tcPr>
-          <w:p>
-            <w:r>
-              <w:rPr>
-                <w:rFonts w:ascii="Arial" w:cs="Arial" w:eastAsia="Arial" w:hAnsi="Arial"/>
-                <w:color w:val="27251F"/>
-                <w:sz w:val="19"/>
-                <w:szCs w:val="19"/>
-              </w:rPr>
-              <w:t xml:space="preserve">The people the trainers train.</w:t>
-            </w:r>
-          </w:p>
-        </w:tc>
-      </w:tr>
-      <w:tr>
-        <w:trPr>
-          <w:cantSplit/>
-          <w:tblHeader w:val="false"/>
-        </w:trPr>
-        <w:tc>
-          <w:tcPr>
-            <w:tcW w:type="dxa" w:w="2600"/>
-            <w:tcBorders>
-              <w:top w:val="single" w:color="D9D9D6" w:sz="4"/>
-              <w:left w:val="single" w:color="D9D9D6" w:sz="4"/>
-              <w:bottom w:val="single" w:color="D9D9D6" w:sz="4"/>
-              <w:right w:val="single" w:color="D9D9D6" w:sz="4"/>
-            </w:tcBorders>
-            <w:shd w:fill="FFFFFF" w:color="auto" w:val="clear"/>
-            <w:tcMar>
-              <w:top w:type="dxa" w:w="70"/>
-              <w:left w:type="dxa" w:w="110"/>
-              <w:bottom w:type="dxa" w:w="70"/>
-              <w:right w:type="dxa" w:w="110"/>
-            </w:tcMar>
-          </w:tcPr>
-          <w:p>
-            <w:r>
-              <w:rPr>
-                <w:rFonts w:ascii="Arial" w:cs="Arial" w:eastAsia="Arial" w:hAnsi="Arial"/>
-                <w:color w:val="27251F"/>
-                <w:sz w:val="19"/>
-                <w:szCs w:val="19"/>
-              </w:rPr>
-              <w:t xml:space="preserve">Required</w:t>
-            </w:r>
-          </w:p>
-        </w:tc>
-        <w:tc>
-          <w:tcPr>
-            <w:tcW w:type="dxa" w:w="6800"/>
-            <w:tcBorders>
-              <w:top w:val="single" w:color="D9D9D6" w:sz="4"/>
-              <w:left w:val="single" w:color="D9D9D6" w:sz="4"/>
-              <w:bottom w:val="single" w:color="D9D9D6" w:sz="4"/>
-              <w:right w:val="single" w:color="D9D9D6" w:sz="4"/>
-            </w:tcBorders>
-            <w:shd w:fill="FFFFFF" w:color="auto" w:val="clear"/>
-            <w:tcMar>
-              <w:top w:type="dxa" w:w="70"/>
-              <w:left w:type="dxa" w:w="110"/>
-              <w:bottom w:type="dxa" w:w="70"/>
-              <w:right w:type="dxa" w:w="110"/>
-            </w:tcMar>
-          </w:tcPr>
-          <w:p>
-            <w:r>
-              <w:rPr>
-                <w:rFonts w:ascii="Arial" w:cs="Arial" w:eastAsia="Arial" w:hAnsi="Arial"/>
-                <w:color w:val="27251F"/>
-                <w:sz w:val="19"/>
-                <w:szCs w:val="19"/>
-              </w:rPr>
-              <w:t xml:space="preserve">Crew level divided by 6, rounded to the nearest whole number (a half rounds up).</w:t>
-            </w:r>
-          </w:p>
-        </w:tc>
-      </w:tr>
-      <w:tr>
-        <w:trPr>
-          <w:cantSplit/>
-          <w:tblHeader w:val="false"/>
-        </w:trPr>
-        <w:tc>
-          <w:tcPr>
-            <w:tcW w:type="dxa" w:w="2600"/>
-            <w:tcBorders>
-              <w:top w:val="single" w:color="D9D9D6" w:sz="4"/>
-              <w:left w:val="single" w:color="D9D9D6" w:sz="4"/>
-              <w:bottom w:val="single" w:color="D9D9D6" w:sz="4"/>
-              <w:right w:val="single" w:color="D9D9D6" w:sz="4"/>
-            </w:tcBorders>
-            <w:shd w:fill="FFFFFF" w:color="auto" w:val="clear"/>
-            <w:tcMar>
-              <w:top w:type="dxa" w:w="70"/>
-              <w:left w:type="dxa" w:w="110"/>
-              <w:bottom w:type="dxa" w:w="70"/>
-              <w:right w:type="dxa" w:w="110"/>
-            </w:tcMar>
-          </w:tcPr>
-          <w:p>
-            <w:r>
-              <w:rPr>
-                <w:rFonts w:ascii="Arial" w:cs="Arial" w:eastAsia="Arial" w:hAnsi="Arial"/>
-                <w:color w:val="27251F"/>
-                <w:sz w:val="19"/>
-                <w:szCs w:val="19"/>
-              </w:rPr>
-              <w:t xml:space="preserve">Actual</w:t>
-            </w:r>
-          </w:p>
-        </w:tc>
-        <w:tc>
-          <w:tcPr>
-            <w:tcW w:type="dxa" w:w="6800"/>
-            <w:tcBorders>
-              <w:top w:val="single" w:color="D9D9D6" w:sz="4"/>
-              <w:left w:val="single" w:color="D9D9D6" w:sz="4"/>
-              <w:bottom w:val="single" w:color="D9D9D6" w:sz="4"/>
-              <w:right w:val="single" w:color="D9D9D6" w:sz="4"/>
-            </w:tcBorders>
-            <w:shd w:fill="FFFFFF" w:color="auto" w:val="clear"/>
-            <w:tcMar>
-              <w:top w:type="dxa" w:w="70"/>
-              <w:left w:type="dxa" w:w="110"/>
-              <w:bottom w:type="dxa" w:w="70"/>
-              <w:right w:type="dxa" w:w="110"/>
-            </w:tcMar>
-          </w:tcPr>
-          <w:p>
-            <w:r>
-              <w:rPr>
-                <w:rFonts w:ascii="Arial" w:cs="Arial" w:eastAsia="Arial" w:hAnsi="Arial"/>
-                <w:color w:val="27251F"/>
-                <w:sz w:val="19"/>
-                <w:szCs w:val="19"/>
-              </w:rPr>
-              <w:t xml:space="preserve">Actual trainers in the store.</w:t>
-            </w:r>
-          </w:p>
-        </w:tc>
-      </w:tr>
-      <w:tr>
-        <w:trPr>
-          <w:cantSplit/>
-          <w:tblHeader w:val="false"/>
-        </w:trPr>
-        <w:tc>
-          <w:tcPr>
-            <w:tcW w:type="dxa" w:w="2600"/>
-            <w:tcBorders>
-              <w:top w:val="single" w:color="D9D9D6" w:sz="4"/>
-              <w:left w:val="single" w:color="D9D9D6" w:sz="4"/>
-              <w:bottom w:val="single" w:color="D9D9D6" w:sz="4"/>
-              <w:right w:val="single" w:color="D9D9D6" w:sz="4"/>
-            </w:tcBorders>
-            <w:shd w:fill="FFFFFF" w:color="auto" w:val="clear"/>
-            <w:tcMar>
-              <w:top w:type="dxa" w:w="70"/>
-              <w:left w:type="dxa" w:w="110"/>
-              <w:bottom w:type="dxa" w:w="70"/>
-              <w:right w:type="dxa" w:w="110"/>
-            </w:tcMar>
-          </w:tcPr>
-          <w:p>
-            <w:r>
-              <w:rPr>
-                <w:rFonts w:ascii="Arial" w:cs="Arial" w:eastAsia="Arial" w:hAnsi="Arial"/>
-                <w:color w:val="27251F"/>
-                <w:sz w:val="19"/>
-                <w:szCs w:val="19"/>
-              </w:rPr>
-              <w:t xml:space="preserve">Gap vs rule</w:t>
-            </w:r>
-          </w:p>
-        </w:tc>
-        <w:tc>
-          <w:tcPr>
-            <w:tcW w:type="dxa" w:w="6800"/>
-            <w:tcBorders>
-              <w:top w:val="single" w:color="D9D9D6" w:sz="4"/>
-              <w:left w:val="single" w:color="D9D9D6" w:sz="4"/>
-              <w:bottom w:val="single" w:color="D9D9D6" w:sz="4"/>
-              <w:right w:val="single" w:color="D9D9D6" w:sz="4"/>
-            </w:tcBorders>
-            <w:shd w:fill="FFFFFF" w:color="auto" w:val="clear"/>
-            <w:tcMar>
-              <w:top w:type="dxa" w:w="70"/>
-              <w:left w:type="dxa" w:w="110"/>
-              <w:bottom w:type="dxa" w:w="70"/>
-              <w:right w:type="dxa" w:w="110"/>
-            </w:tcMar>
-          </w:tcPr>
-          <w:p>
-            <w:r>
-              <w:rPr>
-                <w:rFonts w:ascii="Arial" w:cs="Arial" w:eastAsia="Arial" w:hAnsi="Arial"/>
-                <w:color w:val="27251F"/>
-                <w:sz w:val="19"/>
-                <w:szCs w:val="19"/>
-              </w:rPr>
-              <w:t xml:space="preserve">Actual minus required. Negative = short of trainers, positive = over.</w:t>
-            </w:r>
-          </w:p>
-        </w:tc>
-      </w:tr>
-      <w:tr>
-        <w:trPr>
-          <w:cantSplit/>
-          <w:tblHeader w:val="false"/>
-        </w:trPr>
-        <w:tc>
-          <w:tcPr>
-            <w:tcW w:type="dxa" w:w="2600"/>
-            <w:tcBorders>
-              <w:top w:val="single" w:color="D9D9D6" w:sz="4"/>
-              <w:left w:val="single" w:color="D9D9D6" w:sz="4"/>
-              <w:bottom w:val="single" w:color="D9D9D6" w:sz="4"/>
-              <w:right w:val="single" w:color="D9D9D6" w:sz="4"/>
-            </w:tcBorders>
-            <w:shd w:fill="FFFFFF" w:color="auto" w:val="clear"/>
-            <w:tcMar>
-              <w:top w:type="dxa" w:w="70"/>
-              <w:left w:type="dxa" w:w="110"/>
-              <w:bottom w:type="dxa" w:w="70"/>
-              <w:right w:type="dxa" w:w="110"/>
-            </w:tcMar>
-          </w:tcPr>
-          <w:p>
-            <w:r>
-              <w:rPr>
-                <w:rFonts w:ascii="Arial" w:cs="Arial" w:eastAsia="Arial" w:hAnsi="Arial"/>
-                <w:color w:val="27251F"/>
-                <w:sz w:val="19"/>
-                <w:szCs w:val="19"/>
-              </w:rPr>
-              <w:t xml:space="preserve">Projected / Gap vs plan</w:t>
-            </w:r>
-          </w:p>
-        </w:tc>
-        <w:tc>
-          <w:tcPr>
-            <w:tcW w:type="dxa" w:w="6800"/>
-            <w:tcBorders>
-              <w:top w:val="single" w:color="D9D9D6" w:sz="4"/>
-              <w:left w:val="single" w:color="D9D9D6" w:sz="4"/>
-              <w:bottom w:val="single" w:color="D9D9D6" w:sz="4"/>
-              <w:right w:val="single" w:color="D9D9D6" w:sz="4"/>
-            </w:tcBorders>
-            <w:shd w:fill="FFFFFF" w:color="auto" w:val="clear"/>
-            <w:tcMar>
-              <w:top w:type="dxa" w:w="70"/>
-              <w:left w:type="dxa" w:w="110"/>
-              <w:bottom w:type="dxa" w:w="70"/>
-              <w:right w:type="dxa" w:w="110"/>
-            </w:tcMar>
-          </w:tcPr>
-          <w:p>
-            <w:r>
-              <w:rPr>
-                <w:rFonts w:ascii="Arial" w:cs="Arial" w:eastAsia="Arial" w:hAnsi="Arial"/>
-                <w:color w:val="27251F"/>
-                <w:sz w:val="19"/>
-                <w:szCs w:val="19"/>
-              </w:rPr>
-              <w:t xml:space="preserve">The trainers in the projection, and actual minus projected.</w:t>
-            </w:r>
-          </w:p>
-        </w:tc>
-      </w:tr>
-      <w:tr>
-        <w:trPr>
-          <w:cantSplit/>
-          <w:tblHeader w:val="false"/>
-        </w:trPr>
-        <w:tc>
-          <w:tcPr>
-            <w:tcW w:type="dxa" w:w="2600"/>
-            <w:tcBorders>
-              <w:top w:val="single" w:color="D9D9D6" w:sz="4"/>
-              <w:left w:val="single" w:color="D9D9D6" w:sz="4"/>
-              <w:bottom w:val="single" w:color="D9D9D6" w:sz="4"/>
-              <w:right w:val="single" w:color="D9D9D6" w:sz="4"/>
-            </w:tcBorders>
-            <w:shd w:fill="FFFFFF" w:color="auto" w:val="clear"/>
-            <w:tcMar>
-              <w:top w:type="dxa" w:w="70"/>
-              <w:left w:type="dxa" w:w="110"/>
-              <w:bottom w:type="dxa" w:w="70"/>
-              <w:right w:type="dxa" w:w="110"/>
-            </w:tcMar>
-          </w:tcPr>
-          <w:p>
-            <w:r>
-              <w:rPr>
-                <w:rFonts w:ascii="Arial" w:cs="Arial" w:eastAsia="Arial" w:hAnsi="Arial"/>
-                <w:color w:val="27251F"/>
-                <w:sz w:val="19"/>
-                <w:szCs w:val="19"/>
-              </w:rPr>
-              <w:t xml:space="preserve">Status</w:t>
-            </w:r>
-          </w:p>
-        </w:tc>
-        <w:tc>
-          <w:tcPr>
-            <w:tcW w:type="dxa" w:w="6800"/>
-            <w:tcBorders>
-              <w:top w:val="single" w:color="D9D9D6" w:sz="4"/>
-              <w:left w:val="single" w:color="D9D9D6" w:sz="4"/>
-              <w:bottom w:val="single" w:color="D9D9D6" w:sz="4"/>
-              <w:right w:val="single" w:color="D9D9D6" w:sz="4"/>
-            </w:tcBorders>
-            <w:shd w:fill="FFFFFF" w:color="auto" w:val="clear"/>
-            <w:tcMar>
-              <w:top w:type="dxa" w:w="70"/>
-              <w:left w:type="dxa" w:w="110"/>
-              <w:bottom w:type="dxa" w:w="70"/>
-              <w:right w:type="dxa" w:w="110"/>
-            </w:tcMar>
-          </w:tcPr>
-          <w:p>
-            <w:r>
-              <w:rPr>
-                <w:rFonts w:ascii="Arial" w:cs="Arial" w:eastAsia="Arial" w:hAnsi="Arial"/>
-                <w:color w:val="27251F"/>
-                <w:sz w:val="19"/>
-                <w:szCs w:val="19"/>
-              </w:rPr>
-              <w:t xml:space="preserve">Over, Enough, Short, No trainers, or Not needed (none required and none present).</w:t>
-            </w:r>
-          </w:p>
-        </w:tc>
-      </w:tr>
-    </w:tbl>
-    <w:p>
-      <w:pPr>
-        <w:spacing w:after="40"/>
-      </w:pPr>
-      <w:r>
-        <w:rPr>
-          <w:rFonts w:ascii="Arial" w:cs="Arial" w:eastAsia="Arial" w:hAnsi="Arial"/>
-          <w:color w:val="27251F"/>
-          <w:sz w:val="21"/>
-          <w:szCs w:val="21"/>
-        </w:rPr>
-        <w:t xml:space="preserve"/>
-      </w:r>
-    </w:p>
-    <w:p>
-      <w:pPr>
-        <w:spacing w:after="90" w:line="290"/>
+    <w:p>
+      <w:pPr>
+        <w:spacing w:after="70" w:line="270"/>
       </w:pPr>
       <w:r>
         <w:rPr>
@@ -1656,19 +1656,19 @@
         <w:pStyle w:val="Heading2"/>
       </w:pPr>
       <w:r>
-        <w:t xml:space="preserve">Step 7 - Who is responsible?</w:t>
-      </w:r>
-    </w:p>
-    <w:p>
-      <w:pPr>
-        <w:keepNext w:val="false"/>
+        <w:t xml:space="preserve">Step 7 - Who joined or left the trainer list?</w:t>
+      </w:r>
+    </w:p>
+    <w:p>
+      <w:pPr>
+        <w:keepNext/>
         <w:spacing w:after="120" w:before="60"/>
         <w:jc w:val="center"/>
       </w:pPr>
       <w:r>
         <w:drawing>
           <wp:inline distT="0" distB="0" distL="0" distR="0">
-            <wp:extent cx="6953250" cy="3648075"/>
+            <wp:extent cx="6953250" cy="2171700"/>
             <wp:effectExtent t="0" r="0" b="0" l="0"/>
             <wp:docPr id="1" name="" descr="" title=""/>
             <wp:cNvGraphicFramePr>
@@ -1693,7 +1693,7 @@
                   <pic:spPr bwMode="auto">
                     <a:xfrm>
                       <a:off x="0" y="0"/>
-                      <a:ext cx="6953250" cy="3648075"/>
+                      <a:ext cx="6953250" cy="2171700"/>
                     </a:xfrm>
                     <a:prstGeom prst="rect">
                       <a:avLst/>
@@ -1708,6 +1708,53 @@
     </w:p>
     <w:p>
       <w:pPr>
+        <w:spacing w:after="70" w:line="270"/>
+      </w:pPr>
+      <w:r>
+        <w:rPr>
+          <w:rFonts w:ascii="Arial" w:cs="Arial" w:eastAsia="Arial" w:hAnsi="Arial"/>
+          <w:color w:val="27251F"/>
+          <w:sz w:val="21"/>
+          <w:szCs w:val="21"/>
+        </w:rPr>
+        <w:t xml:space="preserve">Who joined and who left the trainer list compared with the previous uploaded list. For people who left, the status tells you why: Resigned (they appear in the resignations), Still working, off the list (still on this month's active list, so the allowance was removed or they moved), or Not on the roster.</w:t>
+      </w:r>
+    </w:p>
+    <w:p>
+      <w:pPr>
+        <w:spacing w:after="90" w:line="290"/>
+      </w:pPr>
+      <w:r>
+        <w:rPr>
+          <w:rFonts w:ascii="Arial" w:cs="Arial" w:eastAsia="Arial" w:hAnsi="Arial"/>
+          <w:b/>
+          <w:bCs/>
+          <w:color w:val="27251F"/>
+          <w:sz w:val="21"/>
+          <w:szCs w:val="21"/>
+        </w:rPr>
+        <w:t xml:space="preserve">What to look at: </w:t>
+      </w:r>
+      <w:r>
+        <w:rPr>
+          <w:rFonts w:ascii="Arial" w:cs="Arial" w:eastAsia="Arial" w:hAnsi="Arial"/>
+          <w:color w:val="27251F"/>
+          <w:sz w:val="21"/>
+          <w:szCs w:val="21"/>
+        </w:rPr>
+        <w:t xml:space="preserve">people marked "Still working, off the list" - they may be trainers that moved or lost their allowance by mistake.</w:t>
+      </w:r>
+    </w:p>
+    <w:p>
+      <w:pPr>
+        <w:pStyle w:val="Heading2"/>
+      </w:pPr>
+      <w:r>
+        <w:t xml:space="preserve">Step 8 - Who is responsible?</w:t>
+      </w:r>
+    </w:p>
+    <w:p>
+      <w:pPr>
         <w:keepNext w:val="false"/>
         <w:spacing w:after="120" w:before="60"/>
         <w:jc w:val="center"/>
@@ -1715,7 +1762,7 @@
       <w:r>
         <w:drawing>
           <wp:inline distT="0" distB="0" distL="0" distR="0">
-            <wp:extent cx="6953250" cy="1038225"/>
+            <wp:extent cx="6953250" cy="3648075"/>
             <wp:effectExtent t="0" r="0" b="0" l="0"/>
             <wp:docPr id="1" name="" descr="" title=""/>
             <wp:cNvGraphicFramePr>
@@ -1740,7 +1787,7 @@
                   <pic:spPr bwMode="auto">
                     <a:xfrm>
                       <a:off x="0" y="0"/>
-                      <a:ext cx="6953250" cy="1038225"/>
+                      <a:ext cx="6953250" cy="3648075"/>
                     </a:xfrm>
                     <a:prstGeom prst="rect">
                       <a:avLst/>
@@ -1802,14 +1849,14 @@
     </w:p>
     <w:p>
       <w:pPr>
-        <w:keepNext/>
+        <w:keepNext w:val="false"/>
         <w:spacing w:after="120" w:before="60"/>
         <w:jc w:val="center"/>
       </w:pPr>
       <w:r>
         <w:drawing>
           <wp:inline distT="0" distB="0" distL="0" distR="0">
-            <wp:extent cx="6953250" cy="1257300"/>
+            <wp:extent cx="6953250" cy="1038225"/>
             <wp:effectExtent t="0" r="0" b="0" l="0"/>
             <wp:docPr id="1" name="" descr="" title=""/>
             <wp:cNvGraphicFramePr>
@@ -1834,7 +1881,7 @@
                   <pic:spPr bwMode="auto">
                     <a:xfrm>
                       <a:off x="0" y="0"/>
-                      <a:ext cx="6953250" cy="1257300"/>
+                      <a:ext cx="6953250" cy="1038225"/>
                     </a:xfrm>
                     <a:prstGeom prst="rect">
                       <a:avLst/>
@@ -1849,28 +1896,6 @@
     </w:p>
     <w:p>
       <w:pPr>
-        <w:spacing w:after="70" w:line="270"/>
-      </w:pPr>
-      <w:r>
-        <w:rPr>
-          <w:rFonts w:ascii="Arial" w:cs="Arial" w:eastAsia="Arial" w:hAnsi="Arial"/>
-          <w:color w:val="27251F"/>
-          <w:sz w:val="21"/>
-          <w:szCs w:val="21"/>
-        </w:rPr>
-        <w:t xml:space="preserve">The same figures rolled up by Operation Consultant, Director, Manager and Senior Consultant, with the number of stores each covers.</w:t>
-      </w:r>
-    </w:p>
-    <w:p>
-      <w:pPr>
-        <w:pStyle w:val="Heading2"/>
-      </w:pPr>
-      <w:r>
-        <w:t xml:space="preserve">Step 8 - Who joined or left the trainer list?</w:t>
-      </w:r>
-    </w:p>
-    <w:p>
-      <w:pPr>
         <w:keepNext/>
         <w:spacing w:after="120" w:before="60"/>
         <w:jc w:val="center"/>
@@ -1878,7 +1903,7 @@
       <w:r>
         <w:drawing>
           <wp:inline distT="0" distB="0" distL="0" distR="0">
-            <wp:extent cx="6953250" cy="2171700"/>
+            <wp:extent cx="6953250" cy="1257300"/>
             <wp:effectExtent t="0" r="0" b="0" l="0"/>
             <wp:docPr id="1" name="" descr="" title=""/>
             <wp:cNvGraphicFramePr>
@@ -1903,7 +1928,7 @@
                   <pic:spPr bwMode="auto">
                     <a:xfrm>
                       <a:off x="0" y="0"/>
-                      <a:ext cx="6953250" cy="2171700"/>
+                      <a:ext cx="6953250" cy="1257300"/>
                     </a:xfrm>
                     <a:prstGeom prst="rect">
                       <a:avLst/>
@@ -1927,32 +1952,7 @@
           <w:sz w:val="21"/>
           <w:szCs w:val="21"/>
         </w:rPr>
-        <w:t xml:space="preserve">Who joined and who left the trainer list compared with the previous uploaded list. For people who left, the status tells you why: Resigned (they appear in the resignations), Still working, off the list (still on this month's active list, so the allowance was removed or they moved), or Not on the roster.</w:t>
-      </w:r>
-    </w:p>
-    <w:p>
-      <w:pPr>
-        <w:spacing w:after="90" w:line="290"/>
-      </w:pPr>
-      <w:r>
-        <w:rPr>
-          <w:rFonts w:ascii="Arial" w:cs="Arial" w:eastAsia="Arial" w:hAnsi="Arial"/>
-          <w:b/>
-          <w:bCs/>
-          <w:color w:val="27251F"/>
-          <w:sz w:val="21"/>
-          <w:szCs w:val="21"/>
-        </w:rPr>
-        <w:t xml:space="preserve">What to look at: </w:t>
-      </w:r>
-      <w:r>
-        <w:rPr>
-          <w:rFonts w:ascii="Arial" w:cs="Arial" w:eastAsia="Arial" w:hAnsi="Arial"/>
-          <w:color w:val="27251F"/>
-          <w:sz w:val="21"/>
-          <w:szCs w:val="21"/>
-        </w:rPr>
-        <w:t xml:space="preserve">people marked "Still working, off the list" - they may be trainers that moved or lost their allowance by mistake.</w:t>
+        <w:t xml:space="preserve">The same figures rolled up by Operation Consultant, Director, Manager and Senior Consultant, with the number of stores each covers.</w:t>
       </w:r>
     </w:p>
     <w:sectPr>

</xml_diff>

<commit_message>
User guide (EN): keep tables on one page; Crew Trainers page 1 fits its 'Then decide' line
Co-Authored-By: Claude Sonnet 5.5 <noreply@anthropic.com>
Claude-Session: https://claude.ai/code/session_019dELNUNjVMr3Ja2mUwBrCu
</commit_message>
<xml_diff>
--- a/docs/user-guide/en/pages/04-crewtrainers.docx
+++ b/docs/user-guide/en/pages/04-crewtrainers.docx
@@ -451,6 +451,9 @@
             </w:tcMar>
           </w:tcPr>
           <w:p>
+            <w:pPr>
+              <w:keepNext/>
+            </w:pPr>
             <w:r>
               <w:rPr>
                 <w:rFonts w:ascii="Arial" w:cs="Arial" w:eastAsia="Arial" w:hAnsi="Arial"/>
@@ -482,6 +485,9 @@
             </w:tcMar>
           </w:tcPr>
           <w:p>
+            <w:pPr>
+              <w:keepNext/>
+            </w:pPr>
             <w:r>
               <w:rPr>
                 <w:rFonts w:ascii="Arial" w:cs="Arial" w:eastAsia="Arial" w:hAnsi="Arial"/>
@@ -519,6 +525,9 @@
             </w:tcMar>
           </w:tcPr>
           <w:p>
+            <w:pPr>
+              <w:keepNext/>
+            </w:pPr>
             <w:r>
               <w:rPr>
                 <w:rFonts w:ascii="Arial" w:cs="Arial" w:eastAsia="Arial" w:hAnsi="Arial"/>
@@ -548,6 +557,9 @@
             </w:tcMar>
           </w:tcPr>
           <w:p>
+            <w:pPr>
+              <w:keepNext/>
+            </w:pPr>
             <w:r>
               <w:rPr>
                 <w:rFonts w:ascii="Arial" w:cs="Arial" w:eastAsia="Arial" w:hAnsi="Arial"/>
@@ -583,6 +595,9 @@
             </w:tcMar>
           </w:tcPr>
           <w:p>
+            <w:pPr>
+              <w:keepNext/>
+            </w:pPr>
             <w:r>
               <w:rPr>
                 <w:rFonts w:ascii="Arial" w:cs="Arial" w:eastAsia="Arial" w:hAnsi="Arial"/>
@@ -612,6 +627,9 @@
             </w:tcMar>
           </w:tcPr>
           <w:p>
+            <w:pPr>
+              <w:keepNext/>
+            </w:pPr>
             <w:r>
               <w:rPr>
                 <w:rFonts w:ascii="Arial" w:cs="Arial" w:eastAsia="Arial" w:hAnsi="Arial"/>
@@ -647,6 +665,9 @@
             </w:tcMar>
           </w:tcPr>
           <w:p>
+            <w:pPr>
+              <w:keepNext/>
+            </w:pPr>
             <w:r>
               <w:rPr>
                 <w:rFonts w:ascii="Arial" w:cs="Arial" w:eastAsia="Arial" w:hAnsi="Arial"/>
@@ -676,6 +697,9 @@
             </w:tcMar>
           </w:tcPr>
           <w:p>
+            <w:pPr>
+              <w:keepNext/>
+            </w:pPr>
             <w:r>
               <w:rPr>
                 <w:rFonts w:ascii="Arial" w:cs="Arial" w:eastAsia="Arial" w:hAnsi="Arial"/>
@@ -711,6 +735,9 @@
             </w:tcMar>
           </w:tcPr>
           <w:p>
+            <w:pPr>
+              <w:keepNext w:val="false"/>
+            </w:pPr>
             <w:r>
               <w:rPr>
                 <w:rFonts w:ascii="Arial" w:cs="Arial" w:eastAsia="Arial" w:hAnsi="Arial"/>
@@ -740,6 +767,9 @@
             </w:tcMar>
           </w:tcPr>
           <w:p>
+            <w:pPr>
+              <w:keepNext w:val="false"/>
+            </w:pPr>
             <w:r>
               <w:rPr>
                 <w:rFonts w:ascii="Arial" w:cs="Arial" w:eastAsia="Arial" w:hAnsi="Arial"/>
@@ -809,7 +839,7 @@
       <w:r>
         <w:drawing>
           <wp:inline distT="0" distB="0" distL="0" distR="0">
-            <wp:extent cx="6953250" cy="1857375"/>
+            <wp:extent cx="4953000" cy="1323975"/>
             <wp:effectExtent t="0" r="0" b="0" l="0"/>
             <wp:docPr id="1" name="" descr="" title=""/>
             <wp:cNvGraphicFramePr>
@@ -834,7 +864,7 @@
                   <pic:spPr bwMode="auto">
                     <a:xfrm>
                       <a:off x="0" y="0"/>
-                      <a:ext cx="6953250" cy="1857375"/>
+                      <a:ext cx="4953000" cy="1323975"/>
                     </a:xfrm>
                     <a:prstGeom prst="rect">
                       <a:avLst/>
@@ -858,7 +888,7 @@
           <w:sz w:val="21"/>
           <w:szCs w:val="21"/>
         </w:rPr>
-        <w:t xml:space="preserve">A few plain sentences worked out from the numbers on the page: trainers against the rule, the stores most short and the stores above the rule, whether extra trainers could cover gaps elsewhere, what the projection plans against what the rule asks for, how the number of trainers changed since the first list, who joined or left the list, and how many trainers resigned. They follow your filters.</w:t>
+        <w:t xml:space="preserve">Plain sentences worked out from the numbers on the page: trainers against the rule, the stores most short or above the rule, whether extra trainers could cover gaps elsewhere, the projection against the rule, how the number of trainers changed, who joined or left the list, and how many resigned. They follow your filters.</w:t>
       </w:r>
     </w:p>
     <w:p>
@@ -1121,6 +1151,9 @@
             </w:tcMar>
           </w:tcPr>
           <w:p>
+            <w:pPr>
+              <w:keepNext/>
+            </w:pPr>
             <w:r>
               <w:rPr>
                 <w:rFonts w:ascii="Arial" w:cs="Arial" w:eastAsia="Arial" w:hAnsi="Arial"/>
@@ -1152,6 +1185,9 @@
             </w:tcMar>
           </w:tcPr>
           <w:p>
+            <w:pPr>
+              <w:keepNext/>
+            </w:pPr>
             <w:r>
               <w:rPr>
                 <w:rFonts w:ascii="Arial" w:cs="Arial" w:eastAsia="Arial" w:hAnsi="Arial"/>
@@ -1189,6 +1225,9 @@
             </w:tcMar>
           </w:tcPr>
           <w:p>
+            <w:pPr>
+              <w:keepNext/>
+            </w:pPr>
             <w:r>
               <w:rPr>
                 <w:rFonts w:ascii="Arial" w:cs="Arial" w:eastAsia="Arial" w:hAnsi="Arial"/>
@@ -1218,6 +1257,9 @@
             </w:tcMar>
           </w:tcPr>
           <w:p>
+            <w:pPr>
+              <w:keepNext/>
+            </w:pPr>
             <w:r>
               <w:rPr>
                 <w:rFonts w:ascii="Arial" w:cs="Arial" w:eastAsia="Arial" w:hAnsi="Arial"/>
@@ -1253,6 +1295,9 @@
             </w:tcMar>
           </w:tcPr>
           <w:p>
+            <w:pPr>
+              <w:keepNext/>
+            </w:pPr>
             <w:r>
               <w:rPr>
                 <w:rFonts w:ascii="Arial" w:cs="Arial" w:eastAsia="Arial" w:hAnsi="Arial"/>
@@ -1282,6 +1327,9 @@
             </w:tcMar>
           </w:tcPr>
           <w:p>
+            <w:pPr>
+              <w:keepNext/>
+            </w:pPr>
             <w:r>
               <w:rPr>
                 <w:rFonts w:ascii="Arial" w:cs="Arial" w:eastAsia="Arial" w:hAnsi="Arial"/>
@@ -1317,6 +1365,9 @@
             </w:tcMar>
           </w:tcPr>
           <w:p>
+            <w:pPr>
+              <w:keepNext/>
+            </w:pPr>
             <w:r>
               <w:rPr>
                 <w:rFonts w:ascii="Arial" w:cs="Arial" w:eastAsia="Arial" w:hAnsi="Arial"/>
@@ -1346,6 +1397,9 @@
             </w:tcMar>
           </w:tcPr>
           <w:p>
+            <w:pPr>
+              <w:keepNext/>
+            </w:pPr>
             <w:r>
               <w:rPr>
                 <w:rFonts w:ascii="Arial" w:cs="Arial" w:eastAsia="Arial" w:hAnsi="Arial"/>
@@ -1381,6 +1435,9 @@
             </w:tcMar>
           </w:tcPr>
           <w:p>
+            <w:pPr>
+              <w:keepNext/>
+            </w:pPr>
             <w:r>
               <w:rPr>
                 <w:rFonts w:ascii="Arial" w:cs="Arial" w:eastAsia="Arial" w:hAnsi="Arial"/>
@@ -1410,6 +1467,9 @@
             </w:tcMar>
           </w:tcPr>
           <w:p>
+            <w:pPr>
+              <w:keepNext/>
+            </w:pPr>
             <w:r>
               <w:rPr>
                 <w:rFonts w:ascii="Arial" w:cs="Arial" w:eastAsia="Arial" w:hAnsi="Arial"/>
@@ -1445,6 +1505,9 @@
             </w:tcMar>
           </w:tcPr>
           <w:p>
+            <w:pPr>
+              <w:keepNext/>
+            </w:pPr>
             <w:r>
               <w:rPr>
                 <w:rFonts w:ascii="Arial" w:cs="Arial" w:eastAsia="Arial" w:hAnsi="Arial"/>
@@ -1474,6 +1537,9 @@
             </w:tcMar>
           </w:tcPr>
           <w:p>
+            <w:pPr>
+              <w:keepNext/>
+            </w:pPr>
             <w:r>
               <w:rPr>
                 <w:rFonts w:ascii="Arial" w:cs="Arial" w:eastAsia="Arial" w:hAnsi="Arial"/>
@@ -1509,6 +1575,9 @@
             </w:tcMar>
           </w:tcPr>
           <w:p>
+            <w:pPr>
+              <w:keepNext w:val="false"/>
+            </w:pPr>
             <w:r>
               <w:rPr>
                 <w:rFonts w:ascii="Arial" w:cs="Arial" w:eastAsia="Arial" w:hAnsi="Arial"/>
@@ -1538,6 +1607,9 @@
             </w:tcMar>
           </w:tcPr>
           <w:p>
+            <w:pPr>
+              <w:keepNext w:val="false"/>
+            </w:pPr>
             <w:r>
               <w:rPr>
                 <w:rFonts w:ascii="Arial" w:cs="Arial" w:eastAsia="Arial" w:hAnsi="Arial"/>

</xml_diff>